<commit_message>
W-43: inject facsimile placeholders into built-in DOCX templates
Add scripts/inject_facsimile_placeholders.py to place
{{ факсимиле_директор }} / {{ факсимиле_печать }} on ALLOWED and WARN
templates. Skip FORBIDDEN templates and Jinja {% %} blocks (rejected by
template_security.py).
</commit_message>
<xml_diff>
--- a/core/Шаблоны/Акт_оказанных_услуг.docx
+++ b/core/Шаблоны/Акт_оказанных_услуг.docx
@@ -367,34 +367,16 @@
               <w:jc w:val="left"/>
             </w:pPr>
             <w:r>
-              <w:rPr>
-                <w:rFonts w:ascii="Times New Roman" w:cs="Times New Roman" w:eastAsia="Times New Roman" w:hAnsi="Times New Roman"/>
-                <w:b w:val="false"/>
-                <w:bCs w:val="false"/>
-                <w:i w:val="false"/>
-                <w:iCs w:val="false"/>
-                <w:sz w:val="20"/>
-                <w:szCs w:val="20"/>
-              </w:rPr>
-              <w:t xml:space="preserve">_____________ /{{ настройки.исполнитель.фио | ио }}/</w:t>
-            </w:r>
-          </w:p>
-          <w:p>
-            <w:pPr>
-              <w:spacing w:after="40" w:before="40"/>
-              <w:jc w:val="left"/>
-            </w:pPr>
-            <w:r>
-              <w:rPr>
-                <w:rFonts w:ascii="Times New Roman" w:cs="Times New Roman" w:eastAsia="Times New Roman" w:hAnsi="Times New Roman"/>
-                <w:b w:val="false"/>
-                <w:bCs w:val="false"/>
-                <w:i/>
-                <w:iCs/>
-                <w:sz w:val="18"/>
-                <w:szCs w:val="18"/>
-              </w:rPr>
-              <w:t xml:space="preserve">М.П.</w:t>
+              <w:t xml:space="preserve"> {{ факсимиле_директор }}  /{{ настройки.исполнитель.фио | ио }}/</w:t>
+            </w:r>
+          </w:p>
+          <w:p>
+            <w:pPr>
+              <w:spacing w:after="40" w:before="40"/>
+              <w:jc w:val="left"/>
+            </w:pPr>
+            <w:r>
+              <w:t>М.П. {{ факсимиле_печать }}</w:t>
             </w:r>
           </w:p>
         </w:tc>

</xml_diff>